<commit_message>
build: GitHub Pages 대신 테일넷 junnnnyserver에 Docker로 배포
정적 파일을 내려주는 nginx 컨테이너로 패키징하고, 컨테이너 포트는 서버
루프백에만 연다. 외부 노출은 Tailscale Serve가 HTTPS 8443으로 맡으며
Funnel을 켜지 않아 테일넷 밖에서는 접근할 수 없다. 기존 443 Funnel 설정은
포트가 달라 건드리지 않는다.

이미지 빌드에 단위 테스트와 타입 검사가 들어 있어 통과하지 못하면 배포되지
않는다. 서버에 rsync가 없어 tar 파이프로 소스를 보내고 그 자리에서 빌드한다.
맥은 arm64, 서버는 x86_64라 로컬 이미지를 옮길 수 없기 때문이다.

Draco 디코더가 .wasm으로 배포되므로 nginx에 MIME을 명시했다. 틀리면
브라우저가 스트리밍 컴파일을 거부해 압축된 GLB를 열지 못한다.

GitHub Actions는 배포를 그만두고 테스트와 이미지 빌드 검증만 한다.
Pages 사이트는 내렸고 하위 경로가 없어졌으므로 Vite base도 루트로 되돌렸다.
</commit_message>
<xml_diff>
--- a/docs/MeshCap_최종리포트.docx
+++ b/docs/MeshCap_최종리포트.docx
@@ -105,7 +105,7 @@
           <w:color w:val="3A4049"/>
           <w:sz w:val="21"/>
         </w:rPr>
-        <w:t xml:space="preserve">라이브 데모 · junnnnywon.github.io/meshcap</w:t>
+        <w:t xml:space="preserve">라이브 데모 · junnnnyserver.tail9d6315.ts.net:8443 (테일넷 전용)</w:t>
       </w:r>
     </w:p>
     <w:p>
@@ -813,7 +813,7 @@
         <w:rPr>
           <w:sz w:val="22"/>
         </w:rPr>
-        <w:t xml:space="preserve">서버를 두지 않기로 한 것이 첫 번째 결정입니다. 모델 파일은 창작물이고, 공모전 출품작을 남의 서버에 올리는 일은 그 자체로 부담입니다. 또한 서버가 없으면 심사 기간 중 서비스가 죽을 위험도, 운영 비용도 없습니다. 계산은 전부 브라우저에서 수행하고 GitHub Pages는 정적 파일만 내려줍니다.</w:t>
+        <w:t xml:space="preserve">계산을 서버로 보내지 않기로 한 것이 첫 번째 결정입니다. 모델 파일은 창작물이고, 남의 서버에 올리는 일은 그 자체로 부담입니다. 처리를 전부 브라우저에서 하면 업로드가 아예 없으므로 이 문제가 사라지고, 사용자가 늘어도 서버가 감당할 일이 없습니다. 배포된 것은 정적 파일을 내려주는 nginx 컨테이너 하나뿐이며, 팀이 직접 운영하는 장비에서 Tailscale 테일넷 안에만 열려 있습니다.</w:t>
       </w:r>
     </w:p>
     <w:p>
@@ -2825,7 +2825,7 @@
             <wp:cNvGraphicFramePr/>
             <a:graphic>
               <a:graphicData uri="http://schemas.openxmlformats.org/drawingml/2006/chart">
-                <c:chart xmlns:c="http://schemas.openxmlformats.org/drawingml/2006/chart" r:id="R3315fd05d8774647"/>
+                <c:chart xmlns:c="http://schemas.openxmlformats.org/drawingml/2006/chart" r:id="Rbc5d51161b334143"/>
               </a:graphicData>
             </a:graphic>
           </wp:inline>
@@ -2960,7 +2960,7 @@
                     <pic:cNvPicPr/>
                   </pic:nvPicPr>
                   <pic:blipFill>
-                    <a:blip r:embed="R64dc3597c2c441a0" cstate="print"/>
+                    <a:blip r:embed="R642fbac9accd4a84" cstate="print"/>
                     <a:stretch>
                       <a:fillRect/>
                     </a:stretch>
@@ -3017,7 +3017,7 @@
                     <pic:cNvPicPr/>
                   </pic:nvPicPr>
                   <pic:blipFill>
-                    <a:blip r:embed="R376eaaa3993e43fe" cstate="print"/>
+                    <a:blip r:embed="R13d6fe5dec65450b" cstate="print"/>
                     <a:stretch>
                       <a:fillRect/>
                     </a:stretch>
@@ -3074,7 +3074,7 @@
                     <pic:cNvPicPr/>
                   </pic:nvPicPr>
                   <pic:blipFill>
-                    <a:blip r:embed="R7550598615b146d1" cstate="print"/>
+                    <a:blip r:embed="Ra380a385373b408b" cstate="print"/>
                     <a:stretch>
                       <a:fillRect/>
                     </a:stretch>
@@ -3131,7 +3131,7 @@
                     <pic:cNvPicPr/>
                   </pic:nvPicPr>
                   <pic:blipFill>
-                    <a:blip r:embed="R21fae2189e2141bd" cstate="print"/>
+                    <a:blip r:embed="Rbf275b5aa69c495b" cstate="print"/>
                     <a:stretch>
                       <a:fillRect/>
                     </a:stretch>
@@ -3188,7 +3188,7 @@
                     <pic:cNvPicPr/>
                   </pic:nvPicPr>
                   <pic:blipFill>
-                    <a:blip r:embed="R58e99bd2d78746ac" cstate="print"/>
+                    <a:blip r:embed="R15420974af8b4b96" cstate="print"/>
                     <a:stretch>
                       <a:fillRect/>
                     </a:stretch>
@@ -4671,7 +4671,7 @@
           <w:rFonts w:ascii="Consolas" w:hAnsi="Consolas" w:eastAsia="Consolas"/>
           <w:sz w:val="22"/>
         </w:rPr>
-        <w:t xml:space="preserve">라이브 데모 · https://junnnnywon.github.io/meshcap</w:t>
+        <w:t xml:space="preserve">라이브 데모 · https://junnnnyserver.tail9d6315.ts.net:8443</w:t>
       </w:r>
     </w:p>
     <w:p>
@@ -4695,6 +4695,30 @@
           <w:sz w:val="22"/>
         </w:rPr>
         <w:t xml:space="preserve">웹사이트는 도구 화면 외에 벤치마크, 알고리즘, 프로젝트 소개 네 개 화면으로 구성되어 있습니다. 알고리즘 화면은 본 리포트 5장과 같은 내용을 담고 있으며, 벤치마크 화면에서는 직접 파일을 넣어 같은 기준으로 측정해 볼 수 있습니다.</w:t>
+      </w:r>
+    </w:p>
+    <w:p>
+      <w:pPr>
+        <w:spacing w:after="120"/>
+      </w:pPr>
+      <w:r>
+        <w:rPr>
+          <w:sz w:val="22"/>
+        </w:rPr>
+        <w:t xml:space="preserve">라이브 데모는 팀이 직접 운영하는 장비에서 Docker로 돌아가며 Tailscale 테일넷 안에서만 열립니다. 테일넷 밖에서는 접근할 수 없으므로, 외부에서 확인하시려면 저장소를 내려받아 아래 명령으로 직접 띄우실 수 있습니다. 정적 사이트라 별도 설정 없이 그대로 동작합니다.</w:t>
+      </w:r>
+    </w:p>
+    <w:p>
+      <w:pPr>
+        <w:spacing w:after="240"/>
+        <w:ind w:left="720"/>
+      </w:pPr>
+      <w:r>
+        <w:rPr>
+          <w:rFonts w:ascii="Consolas" w:hAnsi="Consolas" w:eastAsia="Consolas"/>
+          <w:sz w:val="21"/>
+        </w:rPr>
+        <w:t xml:space="preserve">docker compose up -d --build</w:t>
       </w:r>
     </w:p>
     <w:p>
@@ -4966,8 +4990,8 @@
       </w:r>
     </w:p>
     <w:sectPr>
-      <w:footerReference w:type="default" r:id="Rf4e8cf87bb784e7d"/>
-      <w:footerReference w:type="first" r:id="R54a21a7dfabc44d5"/>
+      <w:footerReference w:type="default" r:id="R985475584b284027"/>
+      <w:footerReference w:type="first" r:id="Rade5fc47b21840c5"/>
       <w:pgSz w:w="11906" w:h="16838"/>
       <w:pgMar w:top="1440" w:right="1440" w:bottom="1440" w:left="1440"/>
       <w:titlePg/>

</xml_diff>

<commit_message>
feat: Cloudflare Tunnel로 meshcap.junnnny.kr 공개
나가는 연결만으로 붙는 터널이라 방화벽에 구멍을 내지 않고 서버 IP도 드러나지
않는다. 컨테이너 네트워크 안에서 web을 직접 가리키므로 호스트 포트는 계속
루프백에만 열려 있다. 테일넷 8443도 그대로 둔다.

공개되는 순간 /api/repair는 아무나 부를 수 있는 계산 자원이 된다. 한 번에 수
초의 CPU와 수백 메가바이트를 쓰므로 분당 6회, 동시 연결 2개로 제한했다. 값이
싼 /api/health에는 걸지 않았다. 걸어 두면 새로고침 몇 번에 429가 떠서 앱이
서버가 죽은 것으로 오해한다.

Cloudflare 무료 플랜은 요청 본문을 100MB에서 자른다. 실측으로 95MB는 통과하고
105MB는 413이었다. 삼백만 삼각형이면 좌표만 142MB라 공개 경로로는 보낼 수 없다.
그래서 보내기 전에 크기를 재서 한계를 넘으면 브라우저로 처리하고 그 사실을
화면에 알린다. 한계값이 바뀌어도 멈추지 않도록 413 응답도 폴백으로 받는다.
테일넷 경로에는 이 제한이 없어 512MB까지 보낼 수 있다.

터널 자격증명은 서버의 ~/.cloudflared 에만 두고 저장소에 넣지 않는다. 자격증명이
있으면 배포 스크립트가 공개 도메인까지 함께 올리고, 없으면 테일넷 전용으로 올린다.
</commit_message>
<xml_diff>
--- a/docs/MeshCap_최종리포트.docx
+++ b/docs/MeshCap_최종리포트.docx
@@ -105,7 +105,7 @@
           <w:color w:val="3A4049"/>
           <w:sz w:val="21"/>
         </w:rPr>
-        <w:t xml:space="preserve">라이브 데모 · junnnnyserver.tail9d6315.ts.net:8443 (테일넷 전용)</w:t>
+        <w:t xml:space="preserve">라이브 데모 · meshcap.junnnny.kr</w:t>
       </w:r>
     </w:p>
     <w:p>
@@ -2847,7 +2847,7 @@
             <wp:cNvGraphicFramePr/>
             <a:graphic>
               <a:graphicData uri="http://schemas.openxmlformats.org/drawingml/2006/chart">
-                <c:chart xmlns:c="http://schemas.openxmlformats.org/drawingml/2006/chart" r:id="R11de78abded44ed4"/>
+                <c:chart xmlns:c="http://schemas.openxmlformats.org/drawingml/2006/chart" r:id="Rf60a1ed2d71c4b5b"/>
               </a:graphicData>
             </a:graphic>
           </wp:inline>
@@ -2982,7 +2982,7 @@
                     <pic:cNvPicPr/>
                   </pic:nvPicPr>
                   <pic:blipFill>
-                    <a:blip r:embed="R5b3ab5c1a757406a" cstate="print"/>
+                    <a:blip r:embed="Rdf891604b8874b90" cstate="print"/>
                     <a:stretch>
                       <a:fillRect/>
                     </a:stretch>
@@ -3039,7 +3039,7 @@
                     <pic:cNvPicPr/>
                   </pic:nvPicPr>
                   <pic:blipFill>
-                    <a:blip r:embed="R9aafbcab4fe649c7" cstate="print"/>
+                    <a:blip r:embed="Rb1156d0dfd6a40af" cstate="print"/>
                     <a:stretch>
                       <a:fillRect/>
                     </a:stretch>
@@ -3096,7 +3096,7 @@
                     <pic:cNvPicPr/>
                   </pic:nvPicPr>
                   <pic:blipFill>
-                    <a:blip r:embed="R8c1ef0ba6de6451e" cstate="print"/>
+                    <a:blip r:embed="Rd80320aa8c40478a" cstate="print"/>
                     <a:stretch>
                       <a:fillRect/>
                     </a:stretch>
@@ -3153,7 +3153,7 @@
                     <pic:cNvPicPr/>
                   </pic:nvPicPr>
                   <pic:blipFill>
-                    <a:blip r:embed="R488967ddee784286" cstate="print"/>
+                    <a:blip r:embed="Ra2a787a0f35b48c1" cstate="print"/>
                     <a:stretch>
                       <a:fillRect/>
                     </a:stretch>
@@ -3210,7 +3210,7 @@
                     <pic:cNvPicPr/>
                   </pic:nvPicPr>
                   <pic:blipFill>
-                    <a:blip r:embed="Rbfb2374b24544fde" cstate="print"/>
+                    <a:blip r:embed="R83c8a64f4b644e94" cstate="print"/>
                     <a:stretch>
                       <a:fillRect/>
                     </a:stretch>
@@ -4693,7 +4693,7 @@
           <w:rFonts w:ascii="Consolas" w:hAnsi="Consolas" w:eastAsia="Consolas"/>
           <w:sz w:val="22"/>
         </w:rPr>
-        <w:t xml:space="preserve">라이브 데모 · https://junnnnyserver.tail9d6315.ts.net:8443</w:t>
+        <w:t xml:space="preserve">라이브 데모 · https://meshcap.junnnny.kr</w:t>
       </w:r>
     </w:p>
     <w:p>
@@ -4727,7 +4727,18 @@
         <w:rPr>
           <w:sz w:val="22"/>
         </w:rPr>
-        <w:t xml:space="preserve">라이브 데모는 팀이 직접 운영하는 장비에서 Docker로 돌아가며 Tailscale 테일넷 안에서만 열립니다. 테일넷 밖에서는 접근할 수 없으므로, 외부에서 확인하시려면 저장소를 내려받아 아래 명령으로 직접 띄우실 수 있습니다. 정적 사이트라 별도 설정 없이 그대로 동작합니다.</w:t>
+        <w:t xml:space="preserve">라이브 데모는 팀이 직접 운영하는 장비에서 Docker로 돌아갑니다. 공개 주소는 Cloudflare Tunnel을 거치므로 서버의 포트를 인터넷에 열지 않았고, 접속자에게 장비의 실제 IP가 드러나지 않습니다. 같은 컨테이너를 Tailscale 테일넷 안에서도 열어 두어 팀 내부에서는 전송 크기 제한 없이 쓸 수 있습니다.</w:t>
+      </w:r>
+    </w:p>
+    <w:p>
+      <w:pPr>
+        <w:spacing w:after="120"/>
+      </w:pPr>
+      <w:r>
+        <w:rPr>
+          <w:sz w:val="22"/>
+        </w:rPr>
+        <w:t xml:space="preserve">저장소를 내려받아 직접 띄워 보실 수도 있습니다. 정적 사이트와 연산 서버가 함께 올라옵니다.</w:t>
       </w:r>
     </w:p>
     <w:p>
@@ -5012,8 +5023,8 @@
       </w:r>
     </w:p>
     <w:sectPr>
-      <w:footerReference w:type="default" r:id="R5696f84be09d4647"/>
-      <w:footerReference w:type="first" r:id="Re61639cb70a8430d"/>
+      <w:footerReference w:type="default" r:id="R5a8e8a9e1cb54e3a"/>
+      <w:footerReference w:type="first" r:id="Rf8b1e5464ce245ab"/>
       <w:pgSz w:w="11906" w:h="16838"/>
       <w:pgMar w:top="1440" w:right="1440" w:bottom="1440" w:left="1440"/>
       <w:titlePg/>

</xml_diff>